<commit_message>
Phase-3 Documentation added and Learning.md updated
</commit_message>
<xml_diff>
--- a/docs/LeetCode_Clone_Project_Documentation.docx
+++ b/docs/LeetCode_Clone_Project_Documentation.docx
@@ -141,21 +141,7 @@
         <w:rPr>
           <w:color w:val="333333"/>
         </w:rPr>
-        <w:t xml:space="preserve">A </w:t>
-      </w:r>
-      <w:proofErr w:type="spellStart"/>
-      <w:r>
-        <w:rPr>
-          <w:color w:val="333333"/>
-        </w:rPr>
-        <w:t>LeetCode</w:t>
-      </w:r>
-      <w:proofErr w:type="spellEnd"/>
-      <w:r>
-        <w:rPr>
-          <w:color w:val="333333"/>
-        </w:rPr>
-        <w:t>-inspired coding challenge platform built as a full-stack learning project. The platform allows users to register, browse coding problems, write code in a browser-based editor, submit solutions, and track their submission history.</w:t>
+        <w:t>A LeetCode-inspired coding challenge platform built as a full-stack learning project. The platform allows users to register, browse coding problems, write code in a browser-based editor, submit solutions, and track their submission history.</w:t>
       </w:r>
     </w:p>
     <w:p>
@@ -171,21 +157,7 @@
         <w:rPr>
           <w:color w:val="333333"/>
         </w:rPr>
-        <w:t xml:space="preserve">This is NOT a production replacement for </w:t>
-      </w:r>
-      <w:proofErr w:type="spellStart"/>
-      <w:r>
-        <w:rPr>
-          <w:color w:val="333333"/>
-        </w:rPr>
-        <w:t>LeetCode</w:t>
-      </w:r>
-      <w:proofErr w:type="spellEnd"/>
-      <w:r>
-        <w:rPr>
-          <w:color w:val="333333"/>
-        </w:rPr>
-        <w:t>. It is a structured learning project designed to teach full-stack development skills through real implementation.</w:t>
+        <w:t>This is NOT a production replacement for LeetCode. It is a structured learning project designed to teach full-stack development skills through real implementation.</w:t>
       </w:r>
     </w:p>
     <w:p>
@@ -262,16 +234,8 @@
         <w:rPr>
           <w:color w:val="333333"/>
         </w:rPr>
-        <w:t xml:space="preserve">Implement authentication using JWT and </w:t>
+        <w:t>Implement authentication using JWT and bcrypt</w:t>
       </w:r>
-      <w:proofErr w:type="spellStart"/>
-      <w:r>
-        <w:rPr>
-          <w:color w:val="333333"/>
-        </w:rPr>
-        <w:t>bcrypt</w:t>
-      </w:r>
-      <w:proofErr w:type="spellEnd"/>
     </w:p>
     <w:p>
       <w:pPr>
@@ -686,25 +650,7 @@
                 <w:sz w:val="20"/>
                 <w:szCs w:val="20"/>
               </w:rPr>
-              <w:t xml:space="preserve">React, TypeScript, Vite, Git, GitHub, </w:t>
-            </w:r>
-            <w:proofErr w:type="spellStart"/>
-            <w:r>
-              <w:rPr>
-                <w:color w:val="333333"/>
-                <w:sz w:val="20"/>
-                <w:szCs w:val="20"/>
-              </w:rPr>
-              <w:t>Vercel</w:t>
-            </w:r>
-            <w:proofErr w:type="spellEnd"/>
-            <w:r>
-              <w:rPr>
-                <w:color w:val="333333"/>
-                <w:sz w:val="20"/>
-                <w:szCs w:val="20"/>
-              </w:rPr>
-              <w:t>, CSS</w:t>
+              <w:t>React, TypeScript, Vite, Git, GitHub, Vercel, CSS</w:t>
             </w:r>
           </w:p>
         </w:tc>
@@ -762,25 +708,7 @@
                 <w:sz w:val="20"/>
                 <w:szCs w:val="20"/>
               </w:rPr>
-              <w:t xml:space="preserve">Node.js, Express, PostgreSQL, Prisma, JWT, </w:t>
-            </w:r>
-            <w:proofErr w:type="spellStart"/>
-            <w:r>
-              <w:rPr>
-                <w:color w:val="333333"/>
-                <w:sz w:val="20"/>
-                <w:szCs w:val="20"/>
-              </w:rPr>
-              <w:t>bcrypt</w:t>
-            </w:r>
-            <w:proofErr w:type="spellEnd"/>
-            <w:r>
-              <w:rPr>
-                <w:color w:val="333333"/>
-                <w:sz w:val="20"/>
-                <w:szCs w:val="20"/>
-              </w:rPr>
-              <w:t>, Render</w:t>
+              <w:t>Node.js, Express, PostgreSQL, Prisma, JWT, bcrypt, Render</w:t>
             </w:r>
           </w:p>
         </w:tc>
@@ -1864,7 +1792,6 @@
             </w:tcMar>
           </w:tcPr>
           <w:p>
-            <w:proofErr w:type="spellStart"/>
             <w:r>
               <w:rPr>
                 <w:color w:val="333333"/>
@@ -1873,7 +1800,6 @@
               </w:rPr>
               <w:t>bcrypt</w:t>
             </w:r>
-            <w:proofErr w:type="spellEnd"/>
           </w:p>
         </w:tc>
         <w:tc>
@@ -2208,7 +2134,6 @@
             </w:tcMar>
           </w:tcPr>
           <w:p>
-            <w:proofErr w:type="spellStart"/>
             <w:r>
               <w:rPr>
                 <w:color w:val="333333"/>
@@ -2217,7 +2142,6 @@
               </w:rPr>
               <w:t>Vercel</w:t>
             </w:r>
-            <w:proofErr w:type="spellEnd"/>
           </w:p>
         </w:tc>
         <w:tc>
@@ -3470,11 +3394,10 @@
           <w:p>
             <w:r>
               <w:rPr>
-                <w:color w:val="333333"/>
-                <w:sz w:val="20"/>
-                <w:szCs w:val="20"/>
-              </w:rPr>
-              <w:t>Not Started</w:t>
+                <w:sz w:val="20"/>
+                <w:szCs w:val="20"/>
+              </w:rPr>
+              <w:t>Ended</w:t>
             </w:r>
           </w:p>
         </w:tc>
@@ -3588,7 +3511,7 @@
                 <w:sz w:val="20"/>
                 <w:szCs w:val="20"/>
               </w:rPr>
-              <w:t>Not Started</w:t>
+              <w:t>Started</w:t>
             </w:r>
           </w:p>
         </w:tc>
@@ -3874,18 +3797,8 @@
                 <w:sz w:val="20"/>
                 <w:szCs w:val="20"/>
               </w:rPr>
-              <w:t xml:space="preserve">Polish &amp; </w:t>
-            </w:r>
-            <w:proofErr w:type="gramStart"/>
-            <w:r>
-              <w:rPr>
-                <w:color w:val="333333"/>
-                <w:sz w:val="20"/>
-                <w:szCs w:val="20"/>
-              </w:rPr>
-              <w:t>Deploy</w:t>
-            </w:r>
-            <w:proofErr w:type="gramEnd"/>
+              <w:t>Polish &amp; Deploy</w:t>
+            </w:r>
           </w:p>
         </w:tc>
         <w:tc>
@@ -3912,25 +3825,7 @@
                 <w:sz w:val="20"/>
                 <w:szCs w:val="20"/>
               </w:rPr>
-              <w:t xml:space="preserve">Styling, responsive design, deploy to </w:t>
-            </w:r>
-            <w:proofErr w:type="spellStart"/>
-            <w:r>
-              <w:rPr>
-                <w:color w:val="333333"/>
-                <w:sz w:val="20"/>
-                <w:szCs w:val="20"/>
-              </w:rPr>
-              <w:t>Vercel</w:t>
-            </w:r>
-            <w:proofErr w:type="spellEnd"/>
-            <w:r>
-              <w:rPr>
-                <w:color w:val="333333"/>
-                <w:sz w:val="20"/>
-                <w:szCs w:val="20"/>
-              </w:rPr>
-              <w:t xml:space="preserve"> + Render</w:t>
+              <w:t>Styling, responsive design, deploy to Vercel + Render</w:t>
             </w:r>
           </w:p>
         </w:tc>
@@ -4052,21 +3947,7 @@
         <w:rPr>
           <w:color w:val="333333"/>
         </w:rPr>
-        <w:t xml:space="preserve">Password is hashed using </w:t>
-      </w:r>
-      <w:proofErr w:type="spellStart"/>
-      <w:r>
-        <w:rPr>
-          <w:color w:val="333333"/>
-        </w:rPr>
-        <w:t>bcrypt</w:t>
-      </w:r>
-      <w:proofErr w:type="spellEnd"/>
-      <w:r>
-        <w:rPr>
-          <w:color w:val="333333"/>
-        </w:rPr>
-        <w:t xml:space="preserve"> before storing</w:t>
+        <w:t>Password is hashed using bcrypt before storing</w:t>
       </w:r>
     </w:p>
     <w:p>
@@ -5162,25 +5043,7 @@
                 <w:sz w:val="20"/>
                 <w:szCs w:val="20"/>
               </w:rPr>
-              <w:t>React + TypeScript (</w:t>
-            </w:r>
-            <w:proofErr w:type="spellStart"/>
-            <w:r>
-              <w:rPr>
-                <w:color w:val="333333"/>
-                <w:sz w:val="20"/>
-                <w:szCs w:val="20"/>
-              </w:rPr>
-              <w:t>Vercel</w:t>
-            </w:r>
-            <w:proofErr w:type="spellEnd"/>
-            <w:r>
-              <w:rPr>
-                <w:color w:val="333333"/>
-                <w:sz w:val="20"/>
-                <w:szCs w:val="20"/>
-              </w:rPr>
-              <w:t>)</w:t>
+              <w:t>React + TypeScript (Vercel)</w:t>
             </w:r>
           </w:p>
         </w:tc>
@@ -5523,21 +5386,7 @@
         <w:rPr>
           <w:color w:val="333333"/>
         </w:rPr>
-        <w:t>React sends an HTTP request to Express — e.g. GET /</w:t>
-      </w:r>
-      <w:proofErr w:type="spellStart"/>
-      <w:r>
-        <w:rPr>
-          <w:color w:val="333333"/>
-        </w:rPr>
-        <w:t>api</w:t>
-      </w:r>
-      <w:proofErr w:type="spellEnd"/>
-      <w:r>
-        <w:rPr>
-          <w:color w:val="333333"/>
-        </w:rPr>
-        <w:t>/problems</w:t>
+        <w:t>React sends an HTTP request to Express — e.g. GET /api/problems</w:t>
       </w:r>
     </w:p>
     <w:p>
@@ -5569,43 +5418,7 @@
         <w:rPr>
           <w:color w:val="333333"/>
         </w:rPr>
-        <w:t xml:space="preserve">Express calls Prisma — e.g. </w:t>
-      </w:r>
-      <w:proofErr w:type="spellStart"/>
-      <w:proofErr w:type="gramStart"/>
-      <w:r>
-        <w:rPr>
-          <w:color w:val="333333"/>
-        </w:rPr>
-        <w:t>prisma.problem</w:t>
-      </w:r>
-      <w:proofErr w:type="gramEnd"/>
-      <w:r>
-        <w:rPr>
-          <w:color w:val="333333"/>
-        </w:rPr>
-        <w:t>.</w:t>
-      </w:r>
-      <w:proofErr w:type="gramStart"/>
-      <w:r>
-        <w:rPr>
-          <w:color w:val="333333"/>
-        </w:rPr>
-        <w:t>findMany</w:t>
-      </w:r>
-      <w:proofErr w:type="spellEnd"/>
-      <w:r>
-        <w:rPr>
-          <w:color w:val="333333"/>
-        </w:rPr>
-        <w:t>(</w:t>
-      </w:r>
-      <w:proofErr w:type="gramEnd"/>
-      <w:r>
-        <w:rPr>
-          <w:color w:val="333333"/>
-        </w:rPr>
-        <w:t>)</w:t>
+        <w:t>Express calls Prisma — e.g. prisma.problem.findMany()</w:t>
       </w:r>
     </w:p>
     <w:p>
@@ -5739,19 +5552,11 @@
         </w:numPr>
         <w:spacing w:before="60" w:after="60"/>
       </w:pPr>
-      <w:proofErr w:type="spellStart"/>
       <w:r>
         <w:rPr>
           <w:color w:val="333333"/>
         </w:rPr>
-        <w:t>src</w:t>
-      </w:r>
-      <w:proofErr w:type="spellEnd"/>
-      <w:r>
-        <w:rPr>
-          <w:color w:val="333333"/>
-        </w:rPr>
-        <w:t>/</w:t>
+        <w:t>src/</w:t>
       </w:r>
     </w:p>
     <w:p>
@@ -5811,19 +5616,11 @@
         </w:numPr>
         <w:spacing w:before="60" w:after="60"/>
       </w:pPr>
-      <w:proofErr w:type="spellStart"/>
       <w:r>
         <w:rPr>
           <w:color w:val="333333"/>
         </w:rPr>
-        <w:t>prisma</w:t>
-      </w:r>
-      <w:proofErr w:type="spellEnd"/>
-      <w:r>
-        <w:rPr>
-          <w:color w:val="333333"/>
-        </w:rPr>
-        <w:t>/           — Schema and migrations</w:t>
+        <w:t>prisma/           — Schema and migrations</w:t>
       </w:r>
     </w:p>
     <w:p>
@@ -5835,19 +5632,11 @@
         </w:numPr>
         <w:spacing w:before="60" w:after="60"/>
       </w:pPr>
-      <w:proofErr w:type="gramStart"/>
       <w:r>
         <w:rPr>
           <w:color w:val="333333"/>
         </w:rPr>
-        <w:t>.env</w:t>
-      </w:r>
-      <w:proofErr w:type="gramEnd"/>
-      <w:r>
-        <w:rPr>
-          <w:color w:val="333333"/>
-        </w:rPr>
-        <w:t xml:space="preserve">              — Environment variables</w:t>
+        <w:t>.env              — Environment variables</w:t>
       </w:r>
     </w:p>
     <w:p>
@@ -5859,19 +5648,11 @@
         </w:numPr>
         <w:spacing w:before="60" w:after="60"/>
       </w:pPr>
-      <w:proofErr w:type="spellStart"/>
       <w:r>
         <w:rPr>
           <w:color w:val="333333"/>
         </w:rPr>
-        <w:t>server.ts</w:t>
-      </w:r>
-      <w:proofErr w:type="spellEnd"/>
-      <w:r>
-        <w:rPr>
-          <w:color w:val="333333"/>
-        </w:rPr>
-        <w:t xml:space="preserve">         — Entry point</w:t>
+        <w:t>server.ts         — Entry point</w:t>
       </w:r>
     </w:p>
     <w:p>
@@ -5918,19 +5699,11 @@
         </w:numPr>
         <w:spacing w:before="60" w:after="60"/>
       </w:pPr>
-      <w:proofErr w:type="spellStart"/>
       <w:r>
         <w:rPr>
           <w:color w:val="333333"/>
         </w:rPr>
-        <w:t>src</w:t>
-      </w:r>
-      <w:proofErr w:type="spellEnd"/>
-      <w:r>
-        <w:rPr>
-          <w:color w:val="333333"/>
-        </w:rPr>
-        <w:t>/</w:t>
+        <w:t>src/</w:t>
       </w:r>
     </w:p>
     <w:p>
@@ -5974,33 +5747,11 @@
         </w:numPr>
         <w:spacing w:before="60" w:after="60"/>
       </w:pPr>
-      <w:proofErr w:type="spellStart"/>
       <w:r>
         <w:rPr>
           <w:color w:val="333333"/>
         </w:rPr>
-        <w:t>api</w:t>
-      </w:r>
-      <w:proofErr w:type="spellEnd"/>
-      <w:r>
-        <w:rPr>
-          <w:color w:val="333333"/>
-        </w:rPr>
-        <w:t xml:space="preserve">/              — All </w:t>
-      </w:r>
-      <w:proofErr w:type="gramStart"/>
-      <w:r>
-        <w:rPr>
-          <w:color w:val="333333"/>
-        </w:rPr>
-        <w:t>fetch(</w:t>
-      </w:r>
-      <w:proofErr w:type="gramEnd"/>
-      <w:r>
-        <w:rPr>
-          <w:color w:val="333333"/>
-        </w:rPr>
-        <w:t>) calls</w:t>
+        <w:t>api/              — All fetch() calls</w:t>
       </w:r>
     </w:p>
     <w:p>
@@ -6028,19 +5779,11 @@
         </w:numPr>
         <w:spacing w:before="60" w:after="60"/>
       </w:pPr>
-      <w:proofErr w:type="spellStart"/>
       <w:r>
         <w:rPr>
           <w:color w:val="333333"/>
         </w:rPr>
-        <w:t>App.tsx</w:t>
-      </w:r>
-      <w:proofErr w:type="spellEnd"/>
-      <w:r>
-        <w:rPr>
-          <w:color w:val="333333"/>
-        </w:rPr>
-        <w:t xml:space="preserve">           — Root component + routing</w:t>
+        <w:t>App.tsx           — Root component + routing</w:t>
       </w:r>
     </w:p>
     <w:p>
@@ -6291,7 +6034,6 @@
             </w:tcMar>
           </w:tcPr>
           <w:p>
-            <w:proofErr w:type="spellStart"/>
             <w:r>
               <w:rPr>
                 <w:color w:val="333333"/>
@@ -6300,7 +6042,6 @@
               </w:rPr>
               <w:t>test_cases</w:t>
             </w:r>
-            <w:proofErr w:type="spellEnd"/>
           </w:p>
         </w:tc>
         <w:tc>
@@ -6808,7 +6549,6 @@
             </w:tcMar>
           </w:tcPr>
           <w:p>
-            <w:proofErr w:type="spellStart"/>
             <w:r>
               <w:rPr>
                 <w:color w:val="333333"/>
@@ -6817,7 +6557,6 @@
               </w:rPr>
               <w:t>password_hash</w:t>
             </w:r>
-            <w:proofErr w:type="spellEnd"/>
           </w:p>
         </w:tc>
         <w:tc>
@@ -6866,23 +6605,13 @@
             </w:tcMar>
           </w:tcPr>
           <w:p>
-            <w:proofErr w:type="spellStart"/>
-            <w:r>
-              <w:rPr>
-                <w:color w:val="333333"/>
-                <w:sz w:val="20"/>
-                <w:szCs w:val="20"/>
-              </w:rPr>
-              <w:t>bcrypt</w:t>
-            </w:r>
-            <w:proofErr w:type="spellEnd"/>
-            <w:r>
-              <w:rPr>
-                <w:color w:val="333333"/>
-                <w:sz w:val="20"/>
-                <w:szCs w:val="20"/>
-              </w:rPr>
-              <w:t xml:space="preserve"> hash — never plain text</w:t>
+            <w:r>
+              <w:rPr>
+                <w:color w:val="333333"/>
+                <w:sz w:val="20"/>
+                <w:szCs w:val="20"/>
+              </w:rPr>
+              <w:t>bcrypt hash — never plain text</w:t>
             </w:r>
           </w:p>
         </w:tc>
@@ -6906,7 +6635,6 @@
             </w:tcMar>
           </w:tcPr>
           <w:p>
-            <w:proofErr w:type="spellStart"/>
             <w:r>
               <w:rPr>
                 <w:color w:val="333333"/>
@@ -6915,7 +6643,6 @@
               </w:rPr>
               <w:t>created_at</w:t>
             </w:r>
-            <w:proofErr w:type="spellEnd"/>
           </w:p>
         </w:tc>
         <w:tc>
@@ -6936,7 +6663,6 @@
             </w:tcMar>
           </w:tcPr>
           <w:p>
-            <w:proofErr w:type="spellStart"/>
             <w:r>
               <w:rPr>
                 <w:color w:val="333333"/>
@@ -6945,7 +6671,6 @@
               </w:rPr>
               <w:t>DateTime</w:t>
             </w:r>
-            <w:proofErr w:type="spellEnd"/>
           </w:p>
         </w:tc>
         <w:tc>
@@ -7587,23 +7312,13 @@
             </w:tcMar>
           </w:tcPr>
           <w:p>
-            <w:proofErr w:type="gramStart"/>
-            <w:r>
-              <w:rPr>
-                <w:color w:val="333333"/>
-                <w:sz w:val="20"/>
-                <w:szCs w:val="20"/>
-              </w:rPr>
-              <w:t>String[</w:t>
-            </w:r>
-            <w:proofErr w:type="gramEnd"/>
-            <w:r>
-              <w:rPr>
-                <w:color w:val="333333"/>
-                <w:sz w:val="20"/>
-                <w:szCs w:val="20"/>
-              </w:rPr>
-              <w:t>]</w:t>
+            <w:r>
+              <w:rPr>
+                <w:color w:val="333333"/>
+                <w:sz w:val="20"/>
+                <w:szCs w:val="20"/>
+              </w:rPr>
+              <w:t>String[]</w:t>
             </w:r>
           </w:p>
         </w:tc>
@@ -7655,7 +7370,6 @@
             </w:tcMar>
           </w:tcPr>
           <w:p>
-            <w:proofErr w:type="spellStart"/>
             <w:r>
               <w:rPr>
                 <w:color w:val="333333"/>
@@ -7664,7 +7378,6 @@
               </w:rPr>
               <w:t>created_at</w:t>
             </w:r>
-            <w:proofErr w:type="spellEnd"/>
           </w:p>
         </w:tc>
         <w:tc>
@@ -7685,7 +7398,6 @@
             </w:tcMar>
           </w:tcPr>
           <w:p>
-            <w:proofErr w:type="spellStart"/>
             <w:r>
               <w:rPr>
                 <w:color w:val="333333"/>
@@ -7694,7 +7406,6 @@
               </w:rPr>
               <w:t>DateTime</w:t>
             </w:r>
-            <w:proofErr w:type="spellEnd"/>
           </w:p>
         </w:tc>
         <w:tc>
@@ -7736,7 +7447,6 @@
       <w:pPr>
         <w:spacing w:before="200" w:after="100"/>
       </w:pPr>
-      <w:proofErr w:type="spellStart"/>
       <w:r>
         <w:rPr>
           <w:b/>
@@ -7745,7 +7455,6 @@
         </w:rPr>
         <w:t>test_cases</w:t>
       </w:r>
-      <w:proofErr w:type="spellEnd"/>
     </w:p>
     <w:tbl>
       <w:tblPr>
@@ -7967,7 +7676,6 @@
             </w:tcMar>
           </w:tcPr>
           <w:p>
-            <w:proofErr w:type="spellStart"/>
             <w:r>
               <w:rPr>
                 <w:color w:val="333333"/>
@@ -7976,7 +7684,6 @@
               </w:rPr>
               <w:t>problem_id</w:t>
             </w:r>
-            <w:proofErr w:type="spellEnd"/>
           </w:p>
         </w:tc>
         <w:tc>
@@ -8141,7 +7848,6 @@
             </w:tcMar>
           </w:tcPr>
           <w:p>
-            <w:proofErr w:type="spellStart"/>
             <w:r>
               <w:rPr>
                 <w:color w:val="333333"/>
@@ -8150,7 +7856,6 @@
               </w:rPr>
               <w:t>expected_output</w:t>
             </w:r>
-            <w:proofErr w:type="spellEnd"/>
           </w:p>
         </w:tc>
         <w:tc>
@@ -8229,7 +7934,6 @@
             </w:tcMar>
           </w:tcPr>
           <w:p>
-            <w:proofErr w:type="spellStart"/>
             <w:r>
               <w:rPr>
                 <w:color w:val="333333"/>
@@ -8238,7 +7942,6 @@
               </w:rPr>
               <w:t>is_hidden</w:t>
             </w:r>
-            <w:proofErr w:type="spellEnd"/>
           </w:p>
         </w:tc>
         <w:tc>
@@ -8536,7 +8239,6 @@
             </w:tcMar>
           </w:tcPr>
           <w:p>
-            <w:proofErr w:type="spellStart"/>
             <w:r>
               <w:rPr>
                 <w:color w:val="333333"/>
@@ -8545,7 +8247,6 @@
               </w:rPr>
               <w:t>user_id</w:t>
             </w:r>
-            <w:proofErr w:type="spellEnd"/>
           </w:p>
         </w:tc>
         <w:tc>
@@ -8624,7 +8325,6 @@
             </w:tcMar>
           </w:tcPr>
           <w:p>
-            <w:proofErr w:type="spellStart"/>
             <w:r>
               <w:rPr>
                 <w:color w:val="333333"/>
@@ -8633,7 +8333,6 @@
               </w:rPr>
               <w:t>problem_id</w:t>
             </w:r>
-            <w:proofErr w:type="spellEnd"/>
           </w:p>
         </w:tc>
         <w:tc>
@@ -8884,7 +8583,6 @@
             </w:tcMar>
           </w:tcPr>
           <w:p>
-            <w:proofErr w:type="spellStart"/>
             <w:r>
               <w:rPr>
                 <w:color w:val="333333"/>
@@ -8893,7 +8591,6 @@
               </w:rPr>
               <w:t>submitted_at</w:t>
             </w:r>
-            <w:proofErr w:type="spellEnd"/>
           </w:p>
         </w:tc>
         <w:tc>
@@ -8914,7 +8611,6 @@
             </w:tcMar>
           </w:tcPr>
           <w:p>
-            <w:proofErr w:type="spellStart"/>
             <w:r>
               <w:rPr>
                 <w:color w:val="333333"/>
@@ -8923,7 +8619,6 @@
               </w:rPr>
               <w:t>DateTime</w:t>
             </w:r>
-            <w:proofErr w:type="spellEnd"/>
           </w:p>
         </w:tc>
         <w:tc>
@@ -9606,18 +9301,8 @@
                 <w:sz w:val="20"/>
                 <w:szCs w:val="20"/>
               </w:rPr>
-              <w:t>/</w:t>
-            </w:r>
-            <w:proofErr w:type="gramStart"/>
-            <w:r>
-              <w:rPr>
-                <w:color w:val="333333"/>
-                <w:sz w:val="20"/>
-                <w:szCs w:val="20"/>
-              </w:rPr>
-              <w:t>problems</w:t>
-            </w:r>
-            <w:proofErr w:type="gramEnd"/>
+              <w:t>/problems</w:t>
+            </w:r>
           </w:p>
         </w:tc>
         <w:tc>
@@ -9730,18 +9415,8 @@
                 <w:sz w:val="20"/>
                 <w:szCs w:val="20"/>
               </w:rPr>
-              <w:t>/problems</w:t>
-            </w:r>
-            <w:proofErr w:type="gramStart"/>
-            <w:r>
-              <w:rPr>
-                <w:color w:val="333333"/>
-                <w:sz w:val="20"/>
-                <w:szCs w:val="20"/>
-              </w:rPr>
-              <w:t>/:slug</w:t>
-            </w:r>
-            <w:proofErr w:type="gramEnd"/>
+              <w:t>/problems/:slug</w:t>
+            </w:r>
           </w:p>
         </w:tc>
         <w:tc>
@@ -9854,18 +9529,8 @@
                 <w:sz w:val="20"/>
                 <w:szCs w:val="20"/>
               </w:rPr>
-              <w:t>/</w:t>
-            </w:r>
-            <w:proofErr w:type="gramStart"/>
-            <w:r>
-              <w:rPr>
-                <w:color w:val="333333"/>
-                <w:sz w:val="20"/>
-                <w:szCs w:val="20"/>
-              </w:rPr>
-              <w:t>problems</w:t>
-            </w:r>
-            <w:proofErr w:type="gramEnd"/>
+              <w:t>/problems</w:t>
+            </w:r>
           </w:p>
         </w:tc>
         <w:tc>
@@ -10137,18 +9802,8 @@
                 <w:sz w:val="20"/>
                 <w:szCs w:val="20"/>
               </w:rPr>
-              <w:t>/</w:t>
-            </w:r>
-            <w:proofErr w:type="gramStart"/>
-            <w:r>
-              <w:rPr>
-                <w:color w:val="333333"/>
-                <w:sz w:val="20"/>
-                <w:szCs w:val="20"/>
-              </w:rPr>
-              <w:t>submissions</w:t>
-            </w:r>
-            <w:proofErr w:type="gramEnd"/>
+              <w:t>/submissions</w:t>
+            </w:r>
           </w:p>
         </w:tc>
         <w:tc>
@@ -10375,35 +10030,7 @@
                 <w:sz w:val="20"/>
                 <w:szCs w:val="20"/>
               </w:rPr>
-              <w:t>/submissions</w:t>
-            </w:r>
-            <w:proofErr w:type="gramStart"/>
-            <w:r>
-              <w:rPr>
-                <w:color w:val="333333"/>
-                <w:sz w:val="20"/>
-                <w:szCs w:val="20"/>
-              </w:rPr>
-              <w:t>/:</w:t>
-            </w:r>
-            <w:proofErr w:type="spellStart"/>
-            <w:r>
-              <w:rPr>
-                <w:color w:val="333333"/>
-                <w:sz w:val="20"/>
-                <w:szCs w:val="20"/>
-              </w:rPr>
-              <w:t>problemId</w:t>
-            </w:r>
-            <w:proofErr w:type="spellEnd"/>
-            <w:proofErr w:type="gramEnd"/>
-            <w:r>
-              <w:rPr>
-                <w:color w:val="333333"/>
-                <w:sz w:val="20"/>
-                <w:szCs w:val="20"/>
-              </w:rPr>
-              <w:t>/me</w:t>
+              <w:t>/submissions/:problemId/me</w:t>
             </w:r>
           </w:p>
         </w:tc>
@@ -11426,25 +11053,7 @@
                 <w:sz w:val="20"/>
                 <w:szCs w:val="20"/>
               </w:rPr>
-              <w:t xml:space="preserve">Install Prisma, </w:t>
-            </w:r>
-            <w:proofErr w:type="spellStart"/>
-            <w:r>
-              <w:rPr>
-                <w:color w:val="333333"/>
-                <w:sz w:val="20"/>
-                <w:szCs w:val="20"/>
-              </w:rPr>
-              <w:t>ESLint</w:t>
-            </w:r>
-            <w:proofErr w:type="spellEnd"/>
-            <w:r>
-              <w:rPr>
-                <w:color w:val="333333"/>
-                <w:sz w:val="20"/>
-                <w:szCs w:val="20"/>
-              </w:rPr>
-              <w:t>, Prettier extensions</w:t>
+              <w:t>Install Prisma, ESLint, Prettier extensions</w:t>
             </w:r>
           </w:p>
         </w:tc>
@@ -11547,46 +11156,8 @@
                 <w:sz w:val="20"/>
                 <w:szCs w:val="20"/>
               </w:rPr>
-              <w:t xml:space="preserve">New repo: </w:t>
-            </w:r>
-            <w:proofErr w:type="spellStart"/>
-            <w:r>
-              <w:rPr>
-                <w:color w:val="333333"/>
-                <w:sz w:val="20"/>
-                <w:szCs w:val="20"/>
-              </w:rPr>
-              <w:t>leetcode</w:t>
-            </w:r>
-            <w:proofErr w:type="spellEnd"/>
-            <w:r>
-              <w:rPr>
-                <w:color w:val="333333"/>
-                <w:sz w:val="20"/>
-                <w:szCs w:val="20"/>
-              </w:rPr>
-              <w:t xml:space="preserve">-clone. Add README </w:t>
-            </w:r>
-            <w:proofErr w:type="gramStart"/>
-            <w:r>
-              <w:rPr>
-                <w:color w:val="333333"/>
-                <w:sz w:val="20"/>
-                <w:szCs w:val="20"/>
-              </w:rPr>
-              <w:t>and .</w:t>
-            </w:r>
-            <w:proofErr w:type="spellStart"/>
-            <w:r>
-              <w:rPr>
-                <w:color w:val="333333"/>
-                <w:sz w:val="20"/>
-                <w:szCs w:val="20"/>
-              </w:rPr>
-              <w:t>gitignore</w:t>
-            </w:r>
-            <w:proofErr w:type="spellEnd"/>
-            <w:proofErr w:type="gramEnd"/>
+              <w:t>New repo: leetcode-clone. Add README and .gitignore</w:t>
+            </w:r>
           </w:p>
         </w:tc>
         <w:tc>
@@ -11791,54 +11362,8 @@
                 <w:sz w:val="20"/>
                 <w:szCs w:val="20"/>
               </w:rPr>
-              <w:t xml:space="preserve">Run: </w:t>
-            </w:r>
-            <w:proofErr w:type="spellStart"/>
-            <w:r>
-              <w:rPr>
-                <w:color w:val="333333"/>
-                <w:sz w:val="20"/>
-                <w:szCs w:val="20"/>
-              </w:rPr>
-              <w:t>npm</w:t>
-            </w:r>
-            <w:proofErr w:type="spellEnd"/>
-            <w:r>
-              <w:rPr>
-                <w:color w:val="333333"/>
-                <w:sz w:val="20"/>
-                <w:szCs w:val="20"/>
-              </w:rPr>
-              <w:t xml:space="preserve"> create </w:t>
-            </w:r>
-            <w:proofErr w:type="spellStart"/>
-            <w:r>
-              <w:rPr>
-                <w:color w:val="333333"/>
-                <w:sz w:val="20"/>
-                <w:szCs w:val="20"/>
-              </w:rPr>
-              <w:t>vite@latest</w:t>
-            </w:r>
-            <w:proofErr w:type="spellEnd"/>
-            <w:r>
-              <w:rPr>
-                <w:color w:val="333333"/>
-                <w:sz w:val="20"/>
-                <w:szCs w:val="20"/>
-              </w:rPr>
-              <w:t xml:space="preserve"> client -- --template react-</w:t>
-            </w:r>
-            <w:proofErr w:type="spellStart"/>
-            <w:r>
-              <w:rPr>
-                <w:color w:val="333333"/>
-                <w:sz w:val="20"/>
-                <w:szCs w:val="20"/>
-              </w:rPr>
-              <w:t>ts</w:t>
-            </w:r>
-            <w:proofErr w:type="spellEnd"/>
+              <w:t>Run: npm create vite@latest client -- --template react-ts</w:t>
+            </w:r>
           </w:p>
         </w:tc>
         <w:tc>
@@ -11940,61 +11465,7 @@
                 <w:sz w:val="20"/>
                 <w:szCs w:val="20"/>
               </w:rPr>
-              <w:t xml:space="preserve">Run: </w:t>
-            </w:r>
-            <w:proofErr w:type="spellStart"/>
-            <w:r>
-              <w:rPr>
-                <w:color w:val="333333"/>
-                <w:sz w:val="20"/>
-                <w:szCs w:val="20"/>
-              </w:rPr>
-              <w:t>npm</w:t>
-            </w:r>
-            <w:proofErr w:type="spellEnd"/>
-            <w:r>
-              <w:rPr>
-                <w:color w:val="333333"/>
-                <w:sz w:val="20"/>
-                <w:szCs w:val="20"/>
-              </w:rPr>
-              <w:t xml:space="preserve"> </w:t>
-            </w:r>
-            <w:proofErr w:type="spellStart"/>
-            <w:r>
-              <w:rPr>
-                <w:color w:val="333333"/>
-                <w:sz w:val="20"/>
-                <w:szCs w:val="20"/>
-              </w:rPr>
-              <w:t>init</w:t>
-            </w:r>
-            <w:proofErr w:type="spellEnd"/>
-            <w:r>
-              <w:rPr>
-                <w:color w:val="333333"/>
-                <w:sz w:val="20"/>
-                <w:szCs w:val="20"/>
-              </w:rPr>
-              <w:t xml:space="preserve"> -y inside /server, install express typescript </w:t>
-            </w:r>
-            <w:proofErr w:type="spellStart"/>
-            <w:r>
-              <w:rPr>
-                <w:color w:val="333333"/>
-                <w:sz w:val="20"/>
-                <w:szCs w:val="20"/>
-              </w:rPr>
-              <w:t>ts</w:t>
-            </w:r>
-            <w:proofErr w:type="spellEnd"/>
-            <w:r>
-              <w:rPr>
-                <w:color w:val="333333"/>
-                <w:sz w:val="20"/>
-                <w:szCs w:val="20"/>
-              </w:rPr>
-              <w:t>-node</w:t>
+              <w:t>Run: npm init -y inside /server, install express typescript ts-node</w:t>
             </w:r>
           </w:p>
         </w:tc>
@@ -12097,18 +11568,8 @@
                 <w:sz w:val="20"/>
                 <w:szCs w:val="20"/>
               </w:rPr>
-              <w:t>Add DATABASE_URL and JWT_SECRET to /server</w:t>
-            </w:r>
-            <w:proofErr w:type="gramStart"/>
-            <w:r>
-              <w:rPr>
-                <w:color w:val="333333"/>
-                <w:sz w:val="20"/>
-                <w:szCs w:val="20"/>
-              </w:rPr>
-              <w:t>/.env</w:t>
-            </w:r>
-            <w:proofErr w:type="gramEnd"/>
+              <w:t>Add DATABASE_URL and JWT_SECRET to /server/.env</w:t>
+            </w:r>
           </w:p>
         </w:tc>
         <w:tc>
@@ -12210,25 +11671,7 @@
                 <w:sz w:val="20"/>
                 <w:szCs w:val="20"/>
               </w:rPr>
-              <w:t xml:space="preserve">git </w:t>
-            </w:r>
-            <w:proofErr w:type="gramStart"/>
-            <w:r>
-              <w:rPr>
-                <w:color w:val="333333"/>
-                <w:sz w:val="20"/>
-                <w:szCs w:val="20"/>
-              </w:rPr>
-              <w:t>add .</w:t>
-            </w:r>
-            <w:proofErr w:type="gramEnd"/>
-            <w:r>
-              <w:rPr>
-                <w:color w:val="333333"/>
-                <w:sz w:val="20"/>
-                <w:szCs w:val="20"/>
-              </w:rPr>
-              <w:t xml:space="preserve"> git commit -m 'phase 0: project setup' git push</w:t>
+              <w:t>git add . git commit -m 'phase 0: project setup' git push</w:t>
             </w:r>
           </w:p>
         </w:tc>
@@ -12289,43 +11732,7 @@
           <w:bCs/>
           <w:color w:val="1F3864"/>
         </w:rPr>
-        <w:t xml:space="preserve">Definition of Done: Both /client and /server folders exist. </w:t>
-      </w:r>
-      <w:proofErr w:type="spellStart"/>
-      <w:r>
-        <w:rPr>
-          <w:b/>
-          <w:bCs/>
-          <w:color w:val="1F3864"/>
-        </w:rPr>
-        <w:t>npm</w:t>
-      </w:r>
-      <w:proofErr w:type="spellEnd"/>
-      <w:r>
-        <w:rPr>
-          <w:b/>
-          <w:bCs/>
-          <w:color w:val="1F3864"/>
-        </w:rPr>
-        <w:t xml:space="preserve"> run dev works on frontend. node </w:t>
-      </w:r>
-      <w:proofErr w:type="spellStart"/>
-      <w:r>
-        <w:rPr>
-          <w:b/>
-          <w:bCs/>
-          <w:color w:val="1F3864"/>
-        </w:rPr>
-        <w:t>server.ts</w:t>
-      </w:r>
-      <w:proofErr w:type="spellEnd"/>
-      <w:r>
-        <w:rPr>
-          <w:b/>
-          <w:bCs/>
-          <w:color w:val="1F3864"/>
-        </w:rPr>
-        <w:t xml:space="preserve"> starts without errors. Code is on GitHub.</w:t>
+        <w:t>Definition of Done: Both /client and /server folders exist. npm run dev works on frontend. node server.ts starts without errors. Code is on GitHub.</w:t>
       </w:r>
     </w:p>
     <w:p>
@@ -12502,41 +11909,13 @@
             </w:tcMar>
           </w:tcPr>
           <w:p>
-            <w:proofErr w:type="spellStart"/>
-            <w:r>
-              <w:rPr>
-                <w:color w:val="333333"/>
-                <w:sz w:val="20"/>
-                <w:szCs w:val="20"/>
-              </w:rPr>
-              <w:t>npm</w:t>
-            </w:r>
-            <w:proofErr w:type="spellEnd"/>
-            <w:r>
-              <w:rPr>
-                <w:color w:val="333333"/>
-                <w:sz w:val="20"/>
-                <w:szCs w:val="20"/>
-              </w:rPr>
-              <w:t xml:space="preserve"> install express @types/express typescript </w:t>
-            </w:r>
-            <w:proofErr w:type="spellStart"/>
-            <w:r>
-              <w:rPr>
-                <w:color w:val="333333"/>
-                <w:sz w:val="20"/>
-                <w:szCs w:val="20"/>
-              </w:rPr>
-              <w:t>ts</w:t>
-            </w:r>
-            <w:proofErr w:type="spellEnd"/>
-            <w:r>
-              <w:rPr>
-                <w:color w:val="333333"/>
-                <w:sz w:val="20"/>
-                <w:szCs w:val="20"/>
-              </w:rPr>
-              <w:t>-node</w:t>
+            <w:r>
+              <w:rPr>
+                <w:color w:val="333333"/>
+                <w:sz w:val="20"/>
+                <w:szCs w:val="20"/>
+              </w:rPr>
+              <w:t>npm install express @types/express typescript ts-node</w:t>
             </w:r>
           </w:p>
         </w:tc>
@@ -12611,18 +11990,8 @@
                 <w:sz w:val="20"/>
                 <w:szCs w:val="20"/>
               </w:rPr>
-              <w:t xml:space="preserve">Create </w:t>
-            </w:r>
-            <w:proofErr w:type="spellStart"/>
-            <w:r>
-              <w:rPr>
-                <w:color w:val="333333"/>
-                <w:sz w:val="20"/>
-                <w:szCs w:val="20"/>
-              </w:rPr>
-              <w:t>server.ts</w:t>
-            </w:r>
-            <w:proofErr w:type="spellEnd"/>
+              <w:t>Create server.ts</w:t>
+            </w:r>
           </w:p>
         </w:tc>
         <w:tc>
@@ -12746,88 +12115,14 @@
             </w:tcMar>
           </w:tcPr>
           <w:p>
-            <w:proofErr w:type="spellStart"/>
-            <w:r>
-              <w:rPr>
-                <w:color w:val="333333"/>
-                <w:sz w:val="20"/>
-                <w:szCs w:val="20"/>
-              </w:rPr>
-              <w:t>npm</w:t>
-            </w:r>
-            <w:proofErr w:type="spellEnd"/>
-            <w:r>
-              <w:rPr>
-                <w:color w:val="333333"/>
-                <w:sz w:val="20"/>
-                <w:szCs w:val="20"/>
-              </w:rPr>
-              <w:t xml:space="preserve"> install </w:t>
-            </w:r>
-            <w:proofErr w:type="spellStart"/>
-            <w:r>
-              <w:rPr>
-                <w:color w:val="333333"/>
-                <w:sz w:val="20"/>
-                <w:szCs w:val="20"/>
-              </w:rPr>
-              <w:t>prisma</w:t>
-            </w:r>
-            <w:proofErr w:type="spellEnd"/>
-            <w:r>
-              <w:rPr>
-                <w:color w:val="333333"/>
-                <w:sz w:val="20"/>
-                <w:szCs w:val="20"/>
-              </w:rPr>
-              <w:t xml:space="preserve"> @prisma/client. Run: </w:t>
-            </w:r>
-            <w:proofErr w:type="spellStart"/>
-            <w:r>
-              <w:rPr>
-                <w:color w:val="333333"/>
-                <w:sz w:val="20"/>
-                <w:szCs w:val="20"/>
-              </w:rPr>
-              <w:t>npx</w:t>
-            </w:r>
-            <w:proofErr w:type="spellEnd"/>
-            <w:r>
-              <w:rPr>
-                <w:color w:val="333333"/>
-                <w:sz w:val="20"/>
-                <w:szCs w:val="20"/>
-              </w:rPr>
-              <w:t xml:space="preserve"> </w:t>
-            </w:r>
-            <w:proofErr w:type="spellStart"/>
-            <w:r>
-              <w:rPr>
-                <w:color w:val="333333"/>
-                <w:sz w:val="20"/>
-                <w:szCs w:val="20"/>
-              </w:rPr>
-              <w:t>prisma</w:t>
-            </w:r>
-            <w:proofErr w:type="spellEnd"/>
-            <w:r>
-              <w:rPr>
-                <w:color w:val="333333"/>
-                <w:sz w:val="20"/>
-                <w:szCs w:val="20"/>
-              </w:rPr>
-              <w:t xml:space="preserve"> </w:t>
-            </w:r>
-            <w:proofErr w:type="spellStart"/>
-            <w:r>
-              <w:rPr>
-                <w:color w:val="333333"/>
-                <w:sz w:val="20"/>
-                <w:szCs w:val="20"/>
-              </w:rPr>
-              <w:t>init</w:t>
-            </w:r>
-            <w:proofErr w:type="spellEnd"/>
+            <w:r>
+              <w:rPr>
+                <w:color w:val="333333"/>
+                <w:sz w:val="20"/>
+                <w:szCs w:val="20"/>
+              </w:rPr>
+              <w:t>npm install prisma @prisma/client. Run: npx prisma init</w:t>
+            </w:r>
           </w:p>
         </w:tc>
         <w:tc>
@@ -12929,25 +12224,7 @@
                 <w:sz w:val="20"/>
                 <w:szCs w:val="20"/>
               </w:rPr>
-              <w:t xml:space="preserve">Define User, Problem, </w:t>
-            </w:r>
-            <w:proofErr w:type="spellStart"/>
-            <w:r>
-              <w:rPr>
-                <w:color w:val="333333"/>
-                <w:sz w:val="20"/>
-                <w:szCs w:val="20"/>
-              </w:rPr>
-              <w:t>TestCase</w:t>
-            </w:r>
-            <w:proofErr w:type="spellEnd"/>
-            <w:r>
-              <w:rPr>
-                <w:color w:val="333333"/>
-                <w:sz w:val="20"/>
-                <w:szCs w:val="20"/>
-              </w:rPr>
-              <w:t>, Submission models</w:t>
+              <w:t>Define User, Problem, TestCase, Submission models</w:t>
             </w:r>
           </w:p>
         </w:tc>
@@ -13051,18 +12328,8 @@
                 <w:sz w:val="20"/>
                 <w:szCs w:val="20"/>
               </w:rPr>
-              <w:t xml:space="preserve">Create local PostgreSQL database. Add connection URL </w:t>
-            </w:r>
-            <w:proofErr w:type="gramStart"/>
-            <w:r>
-              <w:rPr>
-                <w:color w:val="333333"/>
-                <w:sz w:val="20"/>
-                <w:szCs w:val="20"/>
-              </w:rPr>
-              <w:t>to .env</w:t>
-            </w:r>
-            <w:proofErr w:type="gramEnd"/>
+              <w:t>Create local PostgreSQL database. Add connection URL to .env</w:t>
+            </w:r>
           </w:p>
         </w:tc>
         <w:tc>
@@ -13158,52 +12425,14 @@
             </w:tcMar>
           </w:tcPr>
           <w:p>
-            <w:proofErr w:type="spellStart"/>
-            <w:r>
-              <w:rPr>
-                <w:color w:val="333333"/>
-                <w:sz w:val="20"/>
-                <w:szCs w:val="20"/>
-              </w:rPr>
-              <w:t>npx</w:t>
-            </w:r>
-            <w:proofErr w:type="spellEnd"/>
-            <w:r>
-              <w:rPr>
-                <w:color w:val="333333"/>
-                <w:sz w:val="20"/>
-                <w:szCs w:val="20"/>
-              </w:rPr>
-              <w:t xml:space="preserve"> </w:t>
-            </w:r>
-            <w:proofErr w:type="spellStart"/>
-            <w:r>
-              <w:rPr>
-                <w:color w:val="333333"/>
-                <w:sz w:val="20"/>
-                <w:szCs w:val="20"/>
-              </w:rPr>
-              <w:t>prisma</w:t>
-            </w:r>
-            <w:proofErr w:type="spellEnd"/>
-            <w:r>
-              <w:rPr>
-                <w:color w:val="333333"/>
-                <w:sz w:val="20"/>
-                <w:szCs w:val="20"/>
-              </w:rPr>
-              <w:t xml:space="preserve"> migrate dev --name </w:t>
-            </w:r>
-            <w:proofErr w:type="spellStart"/>
-            <w:r>
-              <w:rPr>
-                <w:color w:val="333333"/>
-                <w:sz w:val="20"/>
-                <w:szCs w:val="20"/>
-              </w:rPr>
-              <w:t>init</w:t>
-            </w:r>
-            <w:proofErr w:type="spellEnd"/>
+            <w:r>
+              <w:rPr>
+                <w:color w:val="333333"/>
+                <w:sz w:val="20"/>
+                <w:szCs w:val="20"/>
+              </w:rPr>
+              <w:t>npx prisma migrate dev --name init</w:t>
+            </w:r>
           </w:p>
         </w:tc>
         <w:tc>
@@ -13408,54 +12637,8 @@
                 <w:sz w:val="20"/>
                 <w:szCs w:val="20"/>
               </w:rPr>
-              <w:t>Create routes/</w:t>
-            </w:r>
-            <w:proofErr w:type="spellStart"/>
-            <w:r>
-              <w:rPr>
-                <w:color w:val="333333"/>
-                <w:sz w:val="20"/>
-                <w:szCs w:val="20"/>
-              </w:rPr>
-              <w:t>auth.ts</w:t>
-            </w:r>
-            <w:proofErr w:type="spellEnd"/>
-            <w:r>
-              <w:rPr>
-                <w:color w:val="333333"/>
-                <w:sz w:val="20"/>
-                <w:szCs w:val="20"/>
-              </w:rPr>
-              <w:t>, routes/</w:t>
-            </w:r>
-            <w:proofErr w:type="spellStart"/>
-            <w:r>
-              <w:rPr>
-                <w:color w:val="333333"/>
-                <w:sz w:val="20"/>
-                <w:szCs w:val="20"/>
-              </w:rPr>
-              <w:t>problems.ts</w:t>
-            </w:r>
-            <w:proofErr w:type="spellEnd"/>
-            <w:r>
-              <w:rPr>
-                <w:color w:val="333333"/>
-                <w:sz w:val="20"/>
-                <w:szCs w:val="20"/>
-              </w:rPr>
-              <w:t>, routes/</w:t>
-            </w:r>
-            <w:proofErr w:type="spellStart"/>
-            <w:r>
-              <w:rPr>
-                <w:color w:val="333333"/>
-                <w:sz w:val="20"/>
-                <w:szCs w:val="20"/>
-              </w:rPr>
-              <w:t>submissions.ts</w:t>
-            </w:r>
-            <w:proofErr w:type="spellEnd"/>
+              <w:t>Create routes/auth.ts, routes/problems.ts, routes/submissions.ts</w:t>
+            </w:r>
           </w:p>
         </w:tc>
         <w:tc>
@@ -13515,25 +12698,7 @@
           <w:bCs/>
           <w:color w:val="1F3864"/>
         </w:rPr>
-        <w:t xml:space="preserve">Definition of Done: Express server runs. Prisma connects to PostgreSQL. Tables created in database. All route files exist and are imported in </w:t>
-      </w:r>
-      <w:proofErr w:type="spellStart"/>
-      <w:r>
-        <w:rPr>
-          <w:b/>
-          <w:bCs/>
-          <w:color w:val="1F3864"/>
-        </w:rPr>
-        <w:t>server.ts</w:t>
-      </w:r>
-      <w:proofErr w:type="spellEnd"/>
-      <w:r>
-        <w:rPr>
-          <w:b/>
-          <w:bCs/>
-          <w:color w:val="1F3864"/>
-        </w:rPr>
-        <w:t>.</w:t>
+        <w:t>Definition of Done: Express server runs. Prisma connects to PostgreSQL. Tables created in database. All route files exist and are imported in server.ts.</w:t>
       </w:r>
     </w:p>
     <w:p>
@@ -13688,25 +12853,7 @@
                 <w:sz w:val="20"/>
                 <w:szCs w:val="20"/>
               </w:rPr>
-              <w:t xml:space="preserve">Install </w:t>
-            </w:r>
-            <w:proofErr w:type="spellStart"/>
-            <w:r>
-              <w:rPr>
-                <w:color w:val="333333"/>
-                <w:sz w:val="20"/>
-                <w:szCs w:val="20"/>
-              </w:rPr>
-              <w:t>bcrypt</w:t>
-            </w:r>
-            <w:proofErr w:type="spellEnd"/>
-            <w:r>
-              <w:rPr>
-                <w:color w:val="333333"/>
-                <w:sz w:val="20"/>
-                <w:szCs w:val="20"/>
-              </w:rPr>
-              <w:t xml:space="preserve"> + JWT</w:t>
+              <w:t>Install bcrypt + JWT</w:t>
             </w:r>
           </w:p>
         </w:tc>
@@ -13728,59 +12875,13 @@
             </w:tcMar>
           </w:tcPr>
           <w:p>
-            <w:proofErr w:type="spellStart"/>
-            <w:r>
-              <w:rPr>
-                <w:color w:val="333333"/>
-                <w:sz w:val="20"/>
-                <w:szCs w:val="20"/>
-              </w:rPr>
-              <w:t>npm</w:t>
-            </w:r>
-            <w:proofErr w:type="spellEnd"/>
-            <w:r>
-              <w:rPr>
-                <w:color w:val="333333"/>
-                <w:sz w:val="20"/>
-                <w:szCs w:val="20"/>
-              </w:rPr>
-              <w:t xml:space="preserve"> install </w:t>
-            </w:r>
-            <w:proofErr w:type="spellStart"/>
-            <w:r>
-              <w:rPr>
-                <w:color w:val="333333"/>
-                <w:sz w:val="20"/>
-                <w:szCs w:val="20"/>
-              </w:rPr>
-              <w:t>bcryptjs</w:t>
-            </w:r>
-            <w:proofErr w:type="spellEnd"/>
-            <w:r>
-              <w:rPr>
-                <w:color w:val="333333"/>
-                <w:sz w:val="20"/>
-                <w:szCs w:val="20"/>
-              </w:rPr>
-              <w:t xml:space="preserve"> </w:t>
-            </w:r>
-            <w:proofErr w:type="spellStart"/>
-            <w:r>
-              <w:rPr>
-                <w:color w:val="333333"/>
-                <w:sz w:val="20"/>
-                <w:szCs w:val="20"/>
-              </w:rPr>
-              <w:t>jsonwebtoken</w:t>
-            </w:r>
-            <w:proofErr w:type="spellEnd"/>
-            <w:r>
-              <w:rPr>
-                <w:color w:val="333333"/>
-                <w:sz w:val="20"/>
-                <w:szCs w:val="20"/>
-              </w:rPr>
-              <w:t xml:space="preserve"> @types/bcryptjs @types/jsonwebtoken</w:t>
+            <w:r>
+              <w:rPr>
+                <w:color w:val="333333"/>
+                <w:sz w:val="20"/>
+                <w:szCs w:val="20"/>
+              </w:rPr>
+              <w:t>npm install bcryptjs jsonwebtoken @types/bcryptjs @types/jsonwebtoken</w:t>
             </w:r>
           </w:p>
         </w:tc>
@@ -13883,25 +12984,7 @@
                 <w:sz w:val="20"/>
                 <w:szCs w:val="20"/>
               </w:rPr>
-              <w:t xml:space="preserve">Hash password with </w:t>
-            </w:r>
-            <w:proofErr w:type="spellStart"/>
-            <w:r>
-              <w:rPr>
-                <w:color w:val="333333"/>
-                <w:sz w:val="20"/>
-                <w:szCs w:val="20"/>
-              </w:rPr>
-              <w:t>bcrypt</w:t>
-            </w:r>
-            <w:proofErr w:type="spellEnd"/>
-            <w:r>
-              <w:rPr>
-                <w:color w:val="333333"/>
-                <w:sz w:val="20"/>
-                <w:szCs w:val="20"/>
-              </w:rPr>
-              <w:t>. Save user to DB. Return JWT.</w:t>
+              <w:t>Hash password with bcrypt. Save user to DB. Return JWT.</w:t>
             </w:r>
           </w:p>
         </w:tc>
@@ -14107,25 +13190,7 @@
                 <w:sz w:val="20"/>
                 <w:szCs w:val="20"/>
               </w:rPr>
-              <w:t>Create middleware/</w:t>
-            </w:r>
-            <w:proofErr w:type="spellStart"/>
-            <w:r>
-              <w:rPr>
-                <w:color w:val="333333"/>
-                <w:sz w:val="20"/>
-                <w:szCs w:val="20"/>
-              </w:rPr>
-              <w:t>auth.ts</w:t>
-            </w:r>
-            <w:proofErr w:type="spellEnd"/>
-            <w:r>
-              <w:rPr>
-                <w:color w:val="333333"/>
-                <w:sz w:val="20"/>
-                <w:szCs w:val="20"/>
-              </w:rPr>
-              <w:t xml:space="preserve"> to verify JWT on protected routes</w:t>
+              <w:t>Create middleware/auth.ts to verify JWT on protected routes</w:t>
             </w:r>
           </w:p>
         </w:tc>
@@ -14603,7 +13668,24 @@
                 <w:sz w:val="20"/>
                 <w:szCs w:val="20"/>
               </w:rPr>
-              <w:t>[ ]</w:t>
+              <w:t xml:space="preserve">[ </w:t>
+            </w:r>
+            <w:r>
+              <w:rPr>
+                <w:rFonts w:ascii="Segoe UI Symbol" w:hAnsi="Segoe UI Symbol" w:cs="Segoe UI Symbol"/>
+                <w:color w:val="333333"/>
+                <w:sz w:val="20"/>
+                <w:szCs w:val="20"/>
+              </w:rPr>
+              <w:t>✔️</w:t>
+            </w:r>
+            <w:r>
+              <w:rPr>
+                <w:color w:val="333333"/>
+                <w:sz w:val="20"/>
+                <w:szCs w:val="20"/>
+              </w:rPr>
+              <w:t>]</w:t>
             </w:r>
           </w:p>
         </w:tc>
@@ -14633,18 +13715,8 @@
                 <w:sz w:val="20"/>
                 <w:szCs w:val="20"/>
               </w:rPr>
-              <w:t>GET /problems</w:t>
-            </w:r>
-            <w:proofErr w:type="gramStart"/>
-            <w:r>
-              <w:rPr>
-                <w:color w:val="333333"/>
-                <w:sz w:val="20"/>
-                <w:szCs w:val="20"/>
-              </w:rPr>
-              <w:t>/:slug</w:t>
-            </w:r>
-            <w:proofErr w:type="gramEnd"/>
+              <w:t>GET /problems/:slug</w:t>
+            </w:r>
           </w:p>
         </w:tc>
         <w:tc>
@@ -14699,7 +13771,24 @@
                 <w:sz w:val="20"/>
                 <w:szCs w:val="20"/>
               </w:rPr>
-              <w:t>[ ]</w:t>
+              <w:t xml:space="preserve">[ </w:t>
+            </w:r>
+            <w:r>
+              <w:rPr>
+                <w:rFonts w:ascii="Segoe UI Symbol" w:hAnsi="Segoe UI Symbol" w:cs="Segoe UI Symbol"/>
+                <w:color w:val="333333"/>
+                <w:sz w:val="20"/>
+                <w:szCs w:val="20"/>
+              </w:rPr>
+              <w:t>✔️</w:t>
+            </w:r>
+            <w:r>
+              <w:rPr>
+                <w:color w:val="333333"/>
+                <w:sz w:val="20"/>
+                <w:szCs w:val="20"/>
+              </w:rPr>
+              <w:t>]</w:t>
             </w:r>
           </w:p>
         </w:tc>
@@ -14785,7 +13874,24 @@
                 <w:sz w:val="20"/>
                 <w:szCs w:val="20"/>
               </w:rPr>
-              <w:t>[ ]</w:t>
+              <w:t xml:space="preserve">[ </w:t>
+            </w:r>
+            <w:r>
+              <w:rPr>
+                <w:rFonts w:ascii="Segoe UI Symbol" w:hAnsi="Segoe UI Symbol" w:cs="Segoe UI Symbol"/>
+                <w:color w:val="333333"/>
+                <w:sz w:val="20"/>
+                <w:szCs w:val="20"/>
+              </w:rPr>
+              <w:t>✔️</w:t>
+            </w:r>
+            <w:r>
+              <w:rPr>
+                <w:color w:val="333333"/>
+                <w:sz w:val="20"/>
+                <w:szCs w:val="20"/>
+              </w:rPr>
+              <w:t>]</w:t>
             </w:r>
           </w:p>
         </w:tc>
@@ -14844,53 +13950,52 @@
                 <w:sz w:val="20"/>
                 <w:szCs w:val="20"/>
               </w:rPr>
-              <w:t xml:space="preserve">Create </w:t>
-            </w:r>
-            <w:proofErr w:type="spellStart"/>
-            <w:r>
-              <w:rPr>
-                <w:color w:val="333333"/>
-                <w:sz w:val="20"/>
-                <w:szCs w:val="20"/>
-              </w:rPr>
-              <w:t>seed.ts</w:t>
-            </w:r>
-            <w:proofErr w:type="spellEnd"/>
-            <w:r>
-              <w:rPr>
-                <w:color w:val="333333"/>
-                <w:sz w:val="20"/>
-                <w:szCs w:val="20"/>
-              </w:rPr>
-              <w:t xml:space="preserve"> to insert 5 sample problems into DB</w:t>
-            </w:r>
-          </w:p>
-        </w:tc>
-        <w:tc>
-          <w:tcPr>
-            <w:tcW w:w="3120" w:type="dxa"/>
-            <w:tcBorders>
-              <w:top w:val="single" w:sz="1" w:space="0" w:color="CCCCCC"/>
-              <w:left w:val="single" w:sz="1" w:space="0" w:color="CCCCCC"/>
-              <w:bottom w:val="single" w:sz="1" w:space="0" w:color="CCCCCC"/>
-              <w:right w:val="single" w:sz="1" w:space="0" w:color="CCCCCC"/>
-            </w:tcBorders>
-            <w:shd w:val="clear" w:color="auto" w:fill="F5F8FF"/>
-            <w:tcMar>
-              <w:top w:w="80" w:type="dxa"/>
-              <w:left w:w="120" w:type="dxa"/>
-              <w:bottom w:w="80" w:type="dxa"/>
-              <w:right w:w="120" w:type="dxa"/>
-            </w:tcMar>
-          </w:tcPr>
-          <w:p>
-            <w:r>
-              <w:rPr>
-                <w:color w:val="333333"/>
-                <w:sz w:val="20"/>
-                <w:szCs w:val="20"/>
-              </w:rPr>
-              <w:t>[ ]</w:t>
+              <w:t>Create seed.ts to insert 5 sample problems into DB</w:t>
+            </w:r>
+          </w:p>
+        </w:tc>
+        <w:tc>
+          <w:tcPr>
+            <w:tcW w:w="3120" w:type="dxa"/>
+            <w:tcBorders>
+              <w:top w:val="single" w:sz="1" w:space="0" w:color="CCCCCC"/>
+              <w:left w:val="single" w:sz="1" w:space="0" w:color="CCCCCC"/>
+              <w:bottom w:val="single" w:sz="1" w:space="0" w:color="CCCCCC"/>
+              <w:right w:val="single" w:sz="1" w:space="0" w:color="CCCCCC"/>
+            </w:tcBorders>
+            <w:shd w:val="clear" w:color="auto" w:fill="F5F8FF"/>
+            <w:tcMar>
+              <w:top w:w="80" w:type="dxa"/>
+              <w:left w:w="120" w:type="dxa"/>
+              <w:bottom w:w="80" w:type="dxa"/>
+              <w:right w:w="120" w:type="dxa"/>
+            </w:tcMar>
+          </w:tcPr>
+          <w:p>
+            <w:r>
+              <w:rPr>
+                <w:color w:val="333333"/>
+                <w:sz w:val="20"/>
+                <w:szCs w:val="20"/>
+              </w:rPr>
+              <w:t xml:space="preserve">[ </w:t>
+            </w:r>
+            <w:r>
+              <w:rPr>
+                <w:rFonts w:ascii="Segoe UI Symbol" w:hAnsi="Segoe UI Symbol" w:cs="Segoe UI Symbol"/>
+                <w:color w:val="333333"/>
+                <w:sz w:val="20"/>
+                <w:szCs w:val="20"/>
+              </w:rPr>
+              <w:t>✔️</w:t>
+            </w:r>
+            <w:r>
+              <w:rPr>
+                <w:color w:val="333333"/>
+                <w:sz w:val="20"/>
+                <w:szCs w:val="20"/>
+              </w:rPr>
+              <w:t>]</w:t>
             </w:r>
           </w:p>
         </w:tc>
@@ -14942,97 +14047,58 @@
             </w:tcMar>
           </w:tcPr>
           <w:p>
-            <w:proofErr w:type="spellStart"/>
-            <w:r>
-              <w:rPr>
-                <w:color w:val="333333"/>
-                <w:sz w:val="20"/>
-                <w:szCs w:val="20"/>
-              </w:rPr>
-              <w:t>npx</w:t>
-            </w:r>
-            <w:proofErr w:type="spellEnd"/>
-            <w:r>
-              <w:rPr>
-                <w:color w:val="333333"/>
-                <w:sz w:val="20"/>
-                <w:szCs w:val="20"/>
-              </w:rPr>
-              <w:t xml:space="preserve"> </w:t>
-            </w:r>
-            <w:proofErr w:type="spellStart"/>
-            <w:r>
-              <w:rPr>
-                <w:color w:val="333333"/>
-                <w:sz w:val="20"/>
-                <w:szCs w:val="20"/>
-              </w:rPr>
-              <w:t>ts</w:t>
-            </w:r>
-            <w:proofErr w:type="spellEnd"/>
-            <w:r>
-              <w:rPr>
-                <w:color w:val="333333"/>
-                <w:sz w:val="20"/>
-                <w:szCs w:val="20"/>
-              </w:rPr>
-              <w:t xml:space="preserve">-node </w:t>
-            </w:r>
-            <w:proofErr w:type="spellStart"/>
-            <w:r>
-              <w:rPr>
-                <w:color w:val="333333"/>
-                <w:sz w:val="20"/>
-                <w:szCs w:val="20"/>
-              </w:rPr>
-              <w:t>prisma</w:t>
-            </w:r>
-            <w:proofErr w:type="spellEnd"/>
-            <w:r>
-              <w:rPr>
-                <w:color w:val="333333"/>
-                <w:sz w:val="20"/>
-                <w:szCs w:val="20"/>
-              </w:rPr>
-              <w:t>/</w:t>
-            </w:r>
-            <w:proofErr w:type="spellStart"/>
-            <w:r>
-              <w:rPr>
-                <w:color w:val="333333"/>
-                <w:sz w:val="20"/>
-                <w:szCs w:val="20"/>
-              </w:rPr>
-              <w:t>seed.ts</w:t>
-            </w:r>
-            <w:proofErr w:type="spellEnd"/>
-          </w:p>
-        </w:tc>
-        <w:tc>
-          <w:tcPr>
-            <w:tcW w:w="3120" w:type="dxa"/>
-            <w:tcBorders>
-              <w:top w:val="single" w:sz="1" w:space="0" w:color="CCCCCC"/>
-              <w:left w:val="single" w:sz="1" w:space="0" w:color="CCCCCC"/>
-              <w:bottom w:val="single" w:sz="1" w:space="0" w:color="CCCCCC"/>
-              <w:right w:val="single" w:sz="1" w:space="0" w:color="CCCCCC"/>
-            </w:tcBorders>
-            <w:shd w:val="clear" w:color="auto" w:fill="F5F8FF"/>
-            <w:tcMar>
-              <w:top w:w="80" w:type="dxa"/>
-              <w:left w:w="120" w:type="dxa"/>
-              <w:bottom w:w="80" w:type="dxa"/>
-              <w:right w:w="120" w:type="dxa"/>
-            </w:tcMar>
-          </w:tcPr>
-          <w:p>
-            <w:r>
-              <w:rPr>
-                <w:color w:val="333333"/>
-                <w:sz w:val="20"/>
-                <w:szCs w:val="20"/>
-              </w:rPr>
-              <w:t>[ ]</w:t>
+            <w:r>
+              <w:rPr>
+                <w:color w:val="333333"/>
+                <w:sz w:val="20"/>
+                <w:szCs w:val="20"/>
+              </w:rPr>
+              <w:t>npx ts-node prisma/seed.ts</w:t>
+            </w:r>
+          </w:p>
+        </w:tc>
+        <w:tc>
+          <w:tcPr>
+            <w:tcW w:w="3120" w:type="dxa"/>
+            <w:tcBorders>
+              <w:top w:val="single" w:sz="1" w:space="0" w:color="CCCCCC"/>
+              <w:left w:val="single" w:sz="1" w:space="0" w:color="CCCCCC"/>
+              <w:bottom w:val="single" w:sz="1" w:space="0" w:color="CCCCCC"/>
+              <w:right w:val="single" w:sz="1" w:space="0" w:color="CCCCCC"/>
+            </w:tcBorders>
+            <w:shd w:val="clear" w:color="auto" w:fill="F5F8FF"/>
+            <w:tcMar>
+              <w:top w:w="80" w:type="dxa"/>
+              <w:left w:w="120" w:type="dxa"/>
+              <w:bottom w:w="80" w:type="dxa"/>
+              <w:right w:w="120" w:type="dxa"/>
+            </w:tcMar>
+          </w:tcPr>
+          <w:p>
+            <w:r>
+              <w:rPr>
+                <w:color w:val="333333"/>
+                <w:sz w:val="20"/>
+                <w:szCs w:val="20"/>
+              </w:rPr>
+              <w:t xml:space="preserve">[ </w:t>
+            </w:r>
+            <w:r>
+              <w:rPr>
+                <w:rFonts w:ascii="Segoe UI Symbol" w:hAnsi="Segoe UI Symbol" w:cs="Segoe UI Symbol"/>
+                <w:color w:val="333333"/>
+                <w:sz w:val="20"/>
+                <w:szCs w:val="20"/>
+              </w:rPr>
+              <w:t>✔️</w:t>
+            </w:r>
+            <w:r>
+              <w:rPr>
+                <w:color w:val="333333"/>
+                <w:sz w:val="20"/>
+                <w:szCs w:val="20"/>
+              </w:rPr>
+              <w:t>]</w:t>
             </w:r>
           </w:p>
         </w:tc>
@@ -15090,53 +14156,52 @@
                 <w:sz w:val="20"/>
                 <w:szCs w:val="20"/>
               </w:rPr>
-              <w:t>Test GET /problems and GET /problems</w:t>
-            </w:r>
-            <w:proofErr w:type="gramStart"/>
-            <w:r>
-              <w:rPr>
-                <w:color w:val="333333"/>
-                <w:sz w:val="20"/>
-                <w:szCs w:val="20"/>
-              </w:rPr>
-              <w:t>/:slug</w:t>
-            </w:r>
-            <w:proofErr w:type="gramEnd"/>
-            <w:r>
-              <w:rPr>
-                <w:color w:val="333333"/>
-                <w:sz w:val="20"/>
-                <w:szCs w:val="20"/>
-              </w:rPr>
-              <w:t xml:space="preserve"> in Postman</w:t>
-            </w:r>
-          </w:p>
-        </w:tc>
-        <w:tc>
-          <w:tcPr>
-            <w:tcW w:w="3120" w:type="dxa"/>
-            <w:tcBorders>
-              <w:top w:val="single" w:sz="1" w:space="0" w:color="CCCCCC"/>
-              <w:left w:val="single" w:sz="1" w:space="0" w:color="CCCCCC"/>
-              <w:bottom w:val="single" w:sz="1" w:space="0" w:color="CCCCCC"/>
-              <w:right w:val="single" w:sz="1" w:space="0" w:color="CCCCCC"/>
-            </w:tcBorders>
-            <w:shd w:val="clear" w:color="auto" w:fill="F5F8FF"/>
-            <w:tcMar>
-              <w:top w:w="80" w:type="dxa"/>
-              <w:left w:w="120" w:type="dxa"/>
-              <w:bottom w:w="80" w:type="dxa"/>
-              <w:right w:w="120" w:type="dxa"/>
-            </w:tcMar>
-          </w:tcPr>
-          <w:p>
-            <w:r>
-              <w:rPr>
-                <w:color w:val="333333"/>
-                <w:sz w:val="20"/>
-                <w:szCs w:val="20"/>
-              </w:rPr>
-              <w:t>[ ]</w:t>
+              <w:t>Test GET /problems and GET /problems/:slug in Postman</w:t>
+            </w:r>
+          </w:p>
+        </w:tc>
+        <w:tc>
+          <w:tcPr>
+            <w:tcW w:w="3120" w:type="dxa"/>
+            <w:tcBorders>
+              <w:top w:val="single" w:sz="1" w:space="0" w:color="CCCCCC"/>
+              <w:left w:val="single" w:sz="1" w:space="0" w:color="CCCCCC"/>
+              <w:bottom w:val="single" w:sz="1" w:space="0" w:color="CCCCCC"/>
+              <w:right w:val="single" w:sz="1" w:space="0" w:color="CCCCCC"/>
+            </w:tcBorders>
+            <w:shd w:val="clear" w:color="auto" w:fill="F5F8FF"/>
+            <w:tcMar>
+              <w:top w:w="80" w:type="dxa"/>
+              <w:left w:w="120" w:type="dxa"/>
+              <w:bottom w:w="80" w:type="dxa"/>
+              <w:right w:w="120" w:type="dxa"/>
+            </w:tcMar>
+          </w:tcPr>
+          <w:p>
+            <w:r>
+              <w:rPr>
+                <w:color w:val="333333"/>
+                <w:sz w:val="20"/>
+                <w:szCs w:val="20"/>
+              </w:rPr>
+              <w:t xml:space="preserve">[ </w:t>
+            </w:r>
+            <w:r>
+              <w:rPr>
+                <w:rFonts w:ascii="Segoe UI Symbol" w:hAnsi="Segoe UI Symbol" w:cs="Segoe UI Symbol"/>
+                <w:color w:val="333333"/>
+                <w:sz w:val="20"/>
+                <w:szCs w:val="20"/>
+              </w:rPr>
+              <w:t>✔️</w:t>
+            </w:r>
+            <w:r>
+              <w:rPr>
+                <w:color w:val="333333"/>
+                <w:sz w:val="20"/>
+                <w:szCs w:val="20"/>
+              </w:rPr>
+              <w:t>]</w:t>
             </w:r>
           </w:p>
         </w:tc>
@@ -15329,34 +14394,14 @@
             </w:tcMar>
           </w:tcPr>
           <w:p>
-            <w:proofErr w:type="spellStart"/>
-            <w:r>
-              <w:rPr>
-                <w:color w:val="333333"/>
-                <w:sz w:val="20"/>
-                <w:szCs w:val="20"/>
-              </w:rPr>
-              <w:t>npm</w:t>
-            </w:r>
-            <w:proofErr w:type="spellEnd"/>
-            <w:r>
-              <w:rPr>
-                <w:color w:val="333333"/>
-                <w:sz w:val="20"/>
-                <w:szCs w:val="20"/>
-              </w:rPr>
-              <w:t xml:space="preserve"> install react-router-</w:t>
-            </w:r>
-            <w:proofErr w:type="spellStart"/>
-            <w:r>
-              <w:rPr>
-                <w:color w:val="333333"/>
-                <w:sz w:val="20"/>
-                <w:szCs w:val="20"/>
-              </w:rPr>
-              <w:t>dom</w:t>
-            </w:r>
-            <w:proofErr w:type="spellEnd"/>
+            <w:r>
+              <w:rPr>
+                <w:color w:val="333333"/>
+                <w:sz w:val="20"/>
+                <w:szCs w:val="20"/>
+              </w:rPr>
+              <w:t>npm install react-router-dom</w:t>
+            </w:r>
           </w:p>
         </w:tc>
         <w:tc>
@@ -15435,70 +14480,14 @@
             </w:tcMar>
           </w:tcPr>
           <w:p>
-            <w:proofErr w:type="spellStart"/>
-            <w:r>
-              <w:rPr>
-                <w:color w:val="333333"/>
-                <w:sz w:val="20"/>
-                <w:szCs w:val="20"/>
-              </w:rPr>
-              <w:t>App.tsx</w:t>
-            </w:r>
-            <w:proofErr w:type="spellEnd"/>
-            <w:r>
-              <w:rPr>
-                <w:color w:val="333333"/>
-                <w:sz w:val="20"/>
-                <w:szCs w:val="20"/>
-              </w:rPr>
-              <w:t xml:space="preserve">: / = </w:t>
-            </w:r>
-            <w:proofErr w:type="spellStart"/>
-            <w:r>
-              <w:rPr>
-                <w:color w:val="333333"/>
-                <w:sz w:val="20"/>
-                <w:szCs w:val="20"/>
-              </w:rPr>
-              <w:t>ProblemsPage</w:t>
-            </w:r>
-            <w:proofErr w:type="spellEnd"/>
-            <w:r>
-              <w:rPr>
-                <w:color w:val="333333"/>
-                <w:sz w:val="20"/>
-                <w:szCs w:val="20"/>
-              </w:rPr>
-              <w:t>, /problems</w:t>
-            </w:r>
-            <w:proofErr w:type="gramStart"/>
-            <w:r>
-              <w:rPr>
-                <w:color w:val="333333"/>
-                <w:sz w:val="20"/>
-                <w:szCs w:val="20"/>
-              </w:rPr>
-              <w:t>/:slug</w:t>
-            </w:r>
-            <w:proofErr w:type="gramEnd"/>
-            <w:r>
-              <w:rPr>
-                <w:color w:val="333333"/>
-                <w:sz w:val="20"/>
-                <w:szCs w:val="20"/>
-              </w:rPr>
-              <w:t xml:space="preserve"> = </w:t>
-            </w:r>
-            <w:proofErr w:type="spellStart"/>
-            <w:r>
-              <w:rPr>
-                <w:color w:val="333333"/>
-                <w:sz w:val="20"/>
-                <w:szCs w:val="20"/>
-              </w:rPr>
-              <w:t>ProblemDetailPage</w:t>
-            </w:r>
-            <w:proofErr w:type="spellEnd"/>
+            <w:r>
+              <w:rPr>
+                <w:color w:val="333333"/>
+                <w:sz w:val="20"/>
+                <w:szCs w:val="20"/>
+              </w:rPr>
+              <w:t>App.tsx: / = ProblemsPage, /problems/:slug = ProblemDetailPage</w:t>
+            </w:r>
           </w:p>
         </w:tc>
         <w:tc>
@@ -15555,18 +14544,8 @@
                 <w:sz w:val="20"/>
                 <w:szCs w:val="20"/>
               </w:rPr>
-              <w:t xml:space="preserve">Create </w:t>
-            </w:r>
-            <w:proofErr w:type="spellStart"/>
-            <w:r>
-              <w:rPr>
-                <w:color w:val="333333"/>
-                <w:sz w:val="20"/>
-                <w:szCs w:val="20"/>
-              </w:rPr>
-              <w:t>ProblemsPage</w:t>
-            </w:r>
-            <w:proofErr w:type="spellEnd"/>
+              <w:t>Create ProblemsPage</w:t>
+            </w:r>
           </w:p>
         </w:tc>
         <w:tc>
@@ -15593,25 +14572,7 @@
                 <w:sz w:val="20"/>
                 <w:szCs w:val="20"/>
               </w:rPr>
-              <w:t>Fetch GET /</w:t>
-            </w:r>
-            <w:proofErr w:type="spellStart"/>
-            <w:r>
-              <w:rPr>
-                <w:color w:val="333333"/>
-                <w:sz w:val="20"/>
-                <w:szCs w:val="20"/>
-              </w:rPr>
-              <w:t>api</w:t>
-            </w:r>
-            <w:proofErr w:type="spellEnd"/>
-            <w:r>
-              <w:rPr>
-                <w:color w:val="333333"/>
-                <w:sz w:val="20"/>
-                <w:szCs w:val="20"/>
-              </w:rPr>
-              <w:t>/problems. Display list with title and difficulty badge.</w:t>
+              <w:t>Fetch GET /api/problems. Display list with title and difficulty badge.</w:t>
             </w:r>
           </w:p>
         </w:tc>
@@ -15669,18 +14630,8 @@
                 <w:sz w:val="20"/>
                 <w:szCs w:val="20"/>
               </w:rPr>
-              <w:t xml:space="preserve">Create </w:t>
-            </w:r>
-            <w:proofErr w:type="spellStart"/>
-            <w:r>
-              <w:rPr>
-                <w:color w:val="333333"/>
-                <w:sz w:val="20"/>
-                <w:szCs w:val="20"/>
-              </w:rPr>
-              <w:t>ProblemDetailPage</w:t>
-            </w:r>
-            <w:proofErr w:type="spellEnd"/>
+              <w:t>Create ProblemDetailPage</w:t>
+            </w:r>
           </w:p>
         </w:tc>
         <w:tc>
@@ -15707,43 +14658,7 @@
                 <w:sz w:val="20"/>
                 <w:szCs w:val="20"/>
               </w:rPr>
-              <w:t>Fetch GET /</w:t>
-            </w:r>
-            <w:proofErr w:type="spellStart"/>
-            <w:r>
-              <w:rPr>
-                <w:color w:val="333333"/>
-                <w:sz w:val="20"/>
-                <w:szCs w:val="20"/>
-              </w:rPr>
-              <w:t>api</w:t>
-            </w:r>
-            <w:proofErr w:type="spellEnd"/>
-            <w:r>
-              <w:rPr>
-                <w:color w:val="333333"/>
-                <w:sz w:val="20"/>
-                <w:szCs w:val="20"/>
-              </w:rPr>
-              <w:t>/problems</w:t>
-            </w:r>
-            <w:proofErr w:type="gramStart"/>
-            <w:r>
-              <w:rPr>
-                <w:color w:val="333333"/>
-                <w:sz w:val="20"/>
-                <w:szCs w:val="20"/>
-              </w:rPr>
-              <w:t>/:slug</w:t>
-            </w:r>
-            <w:proofErr w:type="gramEnd"/>
-            <w:r>
-              <w:rPr>
-                <w:color w:val="333333"/>
-                <w:sz w:val="20"/>
-                <w:szCs w:val="20"/>
-              </w:rPr>
-              <w:t>. Display title, description, examples.</w:t>
+              <w:t>Fetch GET /api/problems/:slug. Display title, description, examples.</w:t>
             </w:r>
           </w:p>
         </w:tc>
@@ -15801,25 +14716,7 @@
                 <w:sz w:val="20"/>
                 <w:szCs w:val="20"/>
               </w:rPr>
-              <w:t xml:space="preserve">Create </w:t>
-            </w:r>
-            <w:proofErr w:type="spellStart"/>
-            <w:r>
-              <w:rPr>
-                <w:color w:val="333333"/>
-                <w:sz w:val="20"/>
-                <w:szCs w:val="20"/>
-              </w:rPr>
-              <w:t>api</w:t>
-            </w:r>
-            <w:proofErr w:type="spellEnd"/>
-            <w:r>
-              <w:rPr>
-                <w:color w:val="333333"/>
-                <w:sz w:val="20"/>
-                <w:szCs w:val="20"/>
-              </w:rPr>
-              <w:t>/ folder</w:t>
+              <w:t>Create api/ folder</w:t>
             </w:r>
           </w:p>
         </w:tc>
@@ -15847,61 +14744,7 @@
                 <w:sz w:val="20"/>
                 <w:szCs w:val="20"/>
               </w:rPr>
-              <w:t>Create client/</w:t>
-            </w:r>
-            <w:proofErr w:type="spellStart"/>
-            <w:r>
-              <w:rPr>
-                <w:color w:val="333333"/>
-                <w:sz w:val="20"/>
-                <w:szCs w:val="20"/>
-              </w:rPr>
-              <w:t>src</w:t>
-            </w:r>
-            <w:proofErr w:type="spellEnd"/>
-            <w:r>
-              <w:rPr>
-                <w:color w:val="333333"/>
-                <w:sz w:val="20"/>
-                <w:szCs w:val="20"/>
-              </w:rPr>
-              <w:t>/</w:t>
-            </w:r>
-            <w:proofErr w:type="spellStart"/>
-            <w:r>
-              <w:rPr>
-                <w:color w:val="333333"/>
-                <w:sz w:val="20"/>
-                <w:szCs w:val="20"/>
-              </w:rPr>
-              <w:t>api</w:t>
-            </w:r>
-            <w:proofErr w:type="spellEnd"/>
-            <w:r>
-              <w:rPr>
-                <w:color w:val="333333"/>
-                <w:sz w:val="20"/>
-                <w:szCs w:val="20"/>
-              </w:rPr>
-              <w:t>/</w:t>
-            </w:r>
-            <w:proofErr w:type="spellStart"/>
-            <w:r>
-              <w:rPr>
-                <w:color w:val="333333"/>
-                <w:sz w:val="20"/>
-                <w:szCs w:val="20"/>
-              </w:rPr>
-              <w:t>problems.ts</w:t>
-            </w:r>
-            <w:proofErr w:type="spellEnd"/>
-            <w:r>
-              <w:rPr>
-                <w:color w:val="333333"/>
-                <w:sz w:val="20"/>
-                <w:szCs w:val="20"/>
-              </w:rPr>
-              <w:t xml:space="preserve"> with fetch functions</w:t>
+              <w:t>Create client/src/api/problems.ts with fetch functions</w:t>
             </w:r>
           </w:p>
         </w:tc>
@@ -16294,23 +15137,13 @@
             </w:tcMar>
           </w:tcPr>
           <w:p>
-            <w:proofErr w:type="spellStart"/>
-            <w:r>
-              <w:rPr>
-                <w:color w:val="333333"/>
-                <w:sz w:val="20"/>
-                <w:szCs w:val="20"/>
-              </w:rPr>
-              <w:t>npm</w:t>
-            </w:r>
-            <w:proofErr w:type="spellEnd"/>
-            <w:r>
-              <w:rPr>
-                <w:color w:val="333333"/>
-                <w:sz w:val="20"/>
-                <w:szCs w:val="20"/>
-              </w:rPr>
-              <w:t xml:space="preserve"> install @monaco-editor/react</w:t>
+            <w:r>
+              <w:rPr>
+                <w:color w:val="333333"/>
+                <w:sz w:val="20"/>
+                <w:szCs w:val="20"/>
+              </w:rPr>
+              <w:t>npm install @monaco-editor/react</w:t>
             </w:r>
           </w:p>
         </w:tc>
@@ -16368,18 +15201,8 @@
                 <w:sz w:val="20"/>
                 <w:szCs w:val="20"/>
               </w:rPr>
-              <w:t xml:space="preserve">Add editor to </w:t>
-            </w:r>
-            <w:proofErr w:type="spellStart"/>
-            <w:r>
-              <w:rPr>
-                <w:color w:val="333333"/>
-                <w:sz w:val="20"/>
-                <w:szCs w:val="20"/>
-              </w:rPr>
-              <w:t>ProblemDetailPage</w:t>
-            </w:r>
-            <w:proofErr w:type="spellEnd"/>
+              <w:t>Add editor to ProblemDetailPage</w:t>
+            </w:r>
           </w:p>
         </w:tc>
         <w:tc>
@@ -16492,25 +15315,7 @@
                 <w:sz w:val="20"/>
                 <w:szCs w:val="20"/>
               </w:rPr>
-              <w:t xml:space="preserve">Default language: JavaScript. Starter code: function </w:t>
-            </w:r>
-            <w:proofErr w:type="gramStart"/>
-            <w:r>
-              <w:rPr>
-                <w:color w:val="333333"/>
-                <w:sz w:val="20"/>
-                <w:szCs w:val="20"/>
-              </w:rPr>
-              <w:t>solution(</w:t>
-            </w:r>
-            <w:proofErr w:type="gramEnd"/>
-            <w:r>
-              <w:rPr>
-                <w:color w:val="333333"/>
-                <w:sz w:val="20"/>
-                <w:szCs w:val="20"/>
-              </w:rPr>
-              <w:t>) {}</w:t>
+              <w:t>Default language: JavaScript. Starter code: function solution() {}</w:t>
             </w:r>
           </w:p>
         </w:tc>
@@ -16910,25 +15715,7 @@
                 <w:sz w:val="20"/>
                 <w:szCs w:val="20"/>
               </w:rPr>
-              <w:t xml:space="preserve">Receive code + </w:t>
-            </w:r>
-            <w:proofErr w:type="spellStart"/>
-            <w:r>
-              <w:rPr>
-                <w:color w:val="333333"/>
-                <w:sz w:val="20"/>
-                <w:szCs w:val="20"/>
-              </w:rPr>
-              <w:t>problemId</w:t>
-            </w:r>
-            <w:proofErr w:type="spellEnd"/>
-            <w:r>
-              <w:rPr>
-                <w:color w:val="333333"/>
-                <w:sz w:val="20"/>
-                <w:szCs w:val="20"/>
-              </w:rPr>
-              <w:t>. Run against test cases. Save result to DB.</w:t>
+              <w:t>Receive code + problemId. Run against test cases. Save result to DB.</w:t>
             </w:r>
           </w:p>
         </w:tc>
@@ -17014,25 +15801,7 @@
                 <w:sz w:val="20"/>
                 <w:szCs w:val="20"/>
               </w:rPr>
-              <w:t xml:space="preserve">Compare user output against </w:t>
-            </w:r>
-            <w:proofErr w:type="spellStart"/>
-            <w:r>
-              <w:rPr>
-                <w:color w:val="333333"/>
-                <w:sz w:val="20"/>
-                <w:szCs w:val="20"/>
-              </w:rPr>
-              <w:t>expected_output</w:t>
-            </w:r>
-            <w:proofErr w:type="spellEnd"/>
-            <w:r>
-              <w:rPr>
-                <w:color w:val="333333"/>
-                <w:sz w:val="20"/>
-                <w:szCs w:val="20"/>
-              </w:rPr>
-              <w:t xml:space="preserve"> from DB</w:t>
+              <w:t>Compare user output against expected_output from DB</w:t>
             </w:r>
           </w:p>
         </w:tc>
@@ -17170,7 +15939,6 @@
             </w:tcMar>
           </w:tcPr>
           <w:p>
-            <w:proofErr w:type="spellStart"/>
             <w:r>
               <w:rPr>
                 <w:color w:val="333333"/>
@@ -17179,7 +15947,6 @@
               </w:rPr>
               <w:t>SubmissionsPage</w:t>
             </w:r>
-            <w:proofErr w:type="spellEnd"/>
           </w:p>
         </w:tc>
         <w:tc>
@@ -17292,25 +16059,7 @@
                 <w:sz w:val="20"/>
                 <w:szCs w:val="20"/>
               </w:rPr>
-              <w:t xml:space="preserve">On </w:t>
-            </w:r>
-            <w:proofErr w:type="spellStart"/>
-            <w:r>
-              <w:rPr>
-                <w:color w:val="333333"/>
-                <w:sz w:val="20"/>
-                <w:szCs w:val="20"/>
-              </w:rPr>
-              <w:t>ProblemDetailPage</w:t>
-            </w:r>
-            <w:proofErr w:type="spellEnd"/>
-            <w:r>
-              <w:rPr>
-                <w:color w:val="333333"/>
-                <w:sz w:val="20"/>
-                <w:szCs w:val="20"/>
-              </w:rPr>
-              <w:t>, show previous submissions for that problem</w:t>
+              <w:t>On ProblemDetailPage, show previous submissions for that problem</w:t>
             </w:r>
           </w:p>
         </w:tc>
@@ -17509,18 +16258,8 @@
                 <w:sz w:val="20"/>
                 <w:szCs w:val="20"/>
               </w:rPr>
-              <w:t xml:space="preserve">Style </w:t>
-            </w:r>
-            <w:proofErr w:type="spellStart"/>
-            <w:r>
-              <w:rPr>
-                <w:color w:val="333333"/>
-                <w:sz w:val="20"/>
-                <w:szCs w:val="20"/>
-              </w:rPr>
-              <w:t>ProblemsPage</w:t>
-            </w:r>
-            <w:proofErr w:type="spellEnd"/>
+              <w:t>Style ProblemsPage</w:t>
+            </w:r>
           </w:p>
         </w:tc>
         <w:tc>
@@ -17605,18 +16344,8 @@
                 <w:sz w:val="20"/>
                 <w:szCs w:val="20"/>
               </w:rPr>
-              <w:t xml:space="preserve">Style </w:t>
-            </w:r>
-            <w:proofErr w:type="spellStart"/>
-            <w:r>
-              <w:rPr>
-                <w:color w:val="333333"/>
-                <w:sz w:val="20"/>
-                <w:szCs w:val="20"/>
-              </w:rPr>
-              <w:t>ProblemDetailPage</w:t>
-            </w:r>
-            <w:proofErr w:type="spellEnd"/>
+              <w:t>Style ProblemDetailPage</w:t>
+            </w:r>
           </w:p>
         </w:tc>
         <w:tc>
@@ -17787,18 +16516,8 @@
                 <w:sz w:val="20"/>
                 <w:szCs w:val="20"/>
               </w:rPr>
-              <w:t xml:space="preserve">Add </w:t>
-            </w:r>
-            <w:proofErr w:type="spellStart"/>
-            <w:r>
-              <w:rPr>
-                <w:color w:val="333333"/>
-                <w:sz w:val="20"/>
-                <w:szCs w:val="20"/>
-              </w:rPr>
-              <w:t>NavBar</w:t>
-            </w:r>
-            <w:proofErr w:type="spellEnd"/>
+              <w:t>Add NavBar</w:t>
+            </w:r>
           </w:p>
         </w:tc>
         <w:tc>
@@ -18056,18 +16775,8 @@
                 <w:sz w:val="20"/>
                 <w:szCs w:val="20"/>
               </w:rPr>
-              <w:t xml:space="preserve">Deploy frontend to </w:t>
-            </w:r>
-            <w:proofErr w:type="spellStart"/>
-            <w:r>
-              <w:rPr>
-                <w:color w:val="333333"/>
-                <w:sz w:val="20"/>
-                <w:szCs w:val="20"/>
-              </w:rPr>
-              <w:t>Vercel</w:t>
-            </w:r>
-            <w:proofErr w:type="spellEnd"/>
+              <w:t>Deploy frontend to Vercel</w:t>
+            </w:r>
           </w:p>
         </w:tc>
         <w:tc>
@@ -18094,25 +16803,7 @@
                 <w:sz w:val="20"/>
                 <w:szCs w:val="20"/>
               </w:rPr>
-              <w:t xml:space="preserve">Push client to GitHub. Import to </w:t>
-            </w:r>
-            <w:proofErr w:type="spellStart"/>
-            <w:r>
-              <w:rPr>
-                <w:color w:val="333333"/>
-                <w:sz w:val="20"/>
-                <w:szCs w:val="20"/>
-              </w:rPr>
-              <w:t>Vercel</w:t>
-            </w:r>
-            <w:proofErr w:type="spellEnd"/>
-            <w:r>
-              <w:rPr>
-                <w:color w:val="333333"/>
-                <w:sz w:val="20"/>
-                <w:szCs w:val="20"/>
-              </w:rPr>
-              <w:t>. Set VITE_API_URL env var.</w:t>
+              <w:t>Push client to GitHub. Import to Vercel. Set VITE_API_URL env var.</w:t>
             </w:r>
           </w:p>
         </w:tc>
@@ -18242,25 +16933,7 @@
           <w:bCs/>
           <w:color w:val="1F3864"/>
         </w:rPr>
-        <w:t xml:space="preserve">Definition of Done: App live on </w:t>
-      </w:r>
-      <w:proofErr w:type="spellStart"/>
-      <w:r>
-        <w:rPr>
-          <w:b/>
-          <w:bCs/>
-          <w:color w:val="1F3864"/>
-        </w:rPr>
-        <w:t>Vercel</w:t>
-      </w:r>
-      <w:proofErr w:type="spellEnd"/>
-      <w:r>
-        <w:rPr>
-          <w:b/>
-          <w:bCs/>
-          <w:color w:val="1F3864"/>
-        </w:rPr>
-        <w:t xml:space="preserve"> + Render. All features working end-to-end on production URLs.</w:t>
+        <w:t>Definition of Done: App live on Vercel + Render. All features working end-to-end on production URLs.</w:t>
       </w:r>
     </w:p>
     <w:p>
@@ -20041,25 +18714,13 @@
             </w:tcMar>
           </w:tcPr>
           <w:p>
-            <w:proofErr w:type="spellStart"/>
-            <w:proofErr w:type="gramStart"/>
-            <w:r>
-              <w:rPr>
-                <w:color w:val="333333"/>
-                <w:sz w:val="20"/>
-                <w:szCs w:val="20"/>
-              </w:rPr>
-              <w:t>Lets</w:t>
-            </w:r>
-            <w:proofErr w:type="spellEnd"/>
-            <w:proofErr w:type="gramEnd"/>
-            <w:r>
-              <w:rPr>
-                <w:color w:val="333333"/>
-                <w:sz w:val="20"/>
-                <w:szCs w:val="20"/>
-              </w:rPr>
-              <w:t xml:space="preserve"> JavaScript run on a server, not just in a browser</w:t>
+            <w:r>
+              <w:rPr>
+                <w:color w:val="333333"/>
+                <w:sz w:val="20"/>
+                <w:szCs w:val="20"/>
+              </w:rPr>
+              <w:t>Lets JavaScript run on a server, not just in a browser</w:t>
             </w:r>
           </w:p>
         </w:tc>
@@ -20315,7 +18976,6 @@
             </w:tcMar>
           </w:tcPr>
           <w:p>
-            <w:proofErr w:type="spellStart"/>
             <w:r>
               <w:rPr>
                 <w:color w:val="333333"/>
@@ -20324,7 +18984,6 @@
               </w:rPr>
               <w:t>bcrypt</w:t>
             </w:r>
-            <w:proofErr w:type="spellEnd"/>
           </w:p>
         </w:tc>
         <w:tc>
@@ -20757,18 +19416,8 @@
                 <w:sz w:val="20"/>
                 <w:szCs w:val="20"/>
               </w:rPr>
-              <w:t xml:space="preserve">A config value stored outside your code — e.g. DATABASE_URL </w:t>
-            </w:r>
-            <w:proofErr w:type="gramStart"/>
-            <w:r>
-              <w:rPr>
-                <w:color w:val="333333"/>
-                <w:sz w:val="20"/>
-                <w:szCs w:val="20"/>
-              </w:rPr>
-              <w:t>in .env</w:t>
-            </w:r>
-            <w:proofErr w:type="gramEnd"/>
+              <w:t>A config value stored outside your code — e.g. DATABASE_URL in .env</w:t>
+            </w:r>
           </w:p>
         </w:tc>
       </w:tr>
@@ -21024,7 +19673,6 @@
             </w:tcMar>
           </w:tcPr>
           <w:p>
-            <w:proofErr w:type="spellStart"/>
             <w:r>
               <w:rPr>
                 <w:color w:val="333333"/>
@@ -21033,7 +19681,6 @@
               </w:rPr>
               <w:t>Vercel</w:t>
             </w:r>
-            <w:proofErr w:type="spellEnd"/>
           </w:p>
         </w:tc>
         <w:tc>

</xml_diff>